<commit_message>
Made new tables for anova of different interactions
</commit_message>
<xml_diff>
--- a/model_table.docx
+++ b/model_table.docx
@@ -1746,7 +1746,7 @@
         <w:tc>
           <w:tcPr>
             <w:tcBorders>
-              <w:bottom w:val="single" w:sz="12" w:space="0" w:color="666666"/>
+              <w:bottom w:val="none" w:sz="0" w:space="0" w:color="000000"/>
               <w:top w:val="none" w:sz="0" w:space="0" w:color="000000"/>
               <w:left w:val="none" w:sz="0" w:space="0" w:color="000000"/>
               <w:right w:val="none" w:sz="0" w:space="0" w:color="000000"/>
@@ -2191,7 +2191,7 @@
         <w:tc>
           <w:tcPr>
             <w:tcBorders>
-              <w:bottom w:val="single" w:sz="12" w:space="0" w:color="666666"/>
+              <w:bottom w:val="none" w:sz="0" w:space="0" w:color="000000"/>
               <w:top w:val="none" w:sz="0" w:space="0" w:color="000000"/>
               <w:left w:val="none" w:sz="0" w:space="0" w:color="000000"/>
               <w:right w:val="none" w:sz="0" w:space="0" w:color="000000"/>
@@ -2636,7 +2636,7 @@
         <w:tc>
           <w:tcPr>
             <w:tcBorders>
-              <w:bottom w:val="single" w:sz="12" w:space="0" w:color="666666"/>
+              <w:bottom w:val="none" w:sz="0" w:space="0" w:color="000000"/>
               <w:top w:val="none" w:sz="0" w:space="0" w:color="000000"/>
               <w:left w:val="none" w:sz="0" w:space="0" w:color="000000"/>
               <w:right w:val="none" w:sz="0" w:space="0" w:color="000000"/>
@@ -3081,7 +3081,7 @@
         <w:tc>
           <w:tcPr>
             <w:tcBorders>
-              <w:bottom w:val="single" w:sz="12" w:space="0" w:color="666666"/>
+              <w:bottom w:val="none" w:sz="0" w:space="0" w:color="000000"/>
               <w:top w:val="none" w:sz="0" w:space="0" w:color="000000"/>
               <w:left w:val="none" w:sz="0" w:space="0" w:color="000000"/>
               <w:right w:val="none" w:sz="0" w:space="0" w:color="000000"/>
@@ -3971,7 +3971,7 @@
         <w:tc>
           <w:tcPr>
             <w:tcBorders>
-              <w:bottom w:val="single" w:sz="12" w:space="0" w:color="666666"/>
+              <w:bottom w:val="none" w:sz="0" w:space="0" w:color="000000"/>
               <w:top w:val="none" w:sz="0" w:space="0" w:color="000000"/>
               <w:left w:val="none" w:sz="0" w:space="0" w:color="000000"/>
               <w:right w:val="none" w:sz="0" w:space="0" w:color="000000"/>
@@ -4416,7 +4416,7 @@
         <w:tc>
           <w:tcPr>
             <w:tcBorders>
-              <w:bottom w:val="single" w:sz="12" w:space="0" w:color="666666"/>
+              <w:bottom w:val="none" w:sz="0" w:space="0" w:color="000000"/>
               <w:top w:val="none" w:sz="0" w:space="0" w:color="000000"/>
               <w:left w:val="none" w:sz="0" w:space="0" w:color="000000"/>
               <w:right w:val="none" w:sz="0" w:space="0" w:color="000000"/>
@@ -5306,7 +5306,7 @@
         <w:tc>
           <w:tcPr>
             <w:tcBorders>
-              <w:bottom w:val="single" w:sz="12" w:space="0" w:color="666666"/>
+              <w:bottom w:val="none" w:sz="0" w:space="0" w:color="000000"/>
               <w:top w:val="none" w:sz="0" w:space="0" w:color="000000"/>
               <w:left w:val="none" w:sz="0" w:space="0" w:color="000000"/>
               <w:right w:val="none" w:sz="0" w:space="0" w:color="000000"/>
@@ -5751,7 +5751,7 @@
         <w:tc>
           <w:tcPr>
             <w:tcBorders>
-              <w:bottom w:val="single" w:sz="12" w:space="0" w:color="666666"/>
+              <w:bottom w:val="none" w:sz="0" w:space="0" w:color="000000"/>
               <w:top w:val="none" w:sz="0" w:space="0" w:color="000000"/>
               <w:left w:val="none" w:sz="0" w:space="0" w:color="000000"/>
               <w:right w:val="none" w:sz="0" w:space="0" w:color="000000"/>
@@ -6196,7 +6196,7 @@
         <w:tc>
           <w:tcPr>
             <w:tcBorders>
-              <w:bottom w:val="single" w:sz="12" w:space="0" w:color="666666"/>
+              <w:bottom w:val="none" w:sz="0" w:space="0" w:color="000000"/>
               <w:top w:val="none" w:sz="0" w:space="0" w:color="000000"/>
               <w:left w:val="none" w:sz="0" w:space="0" w:color="000000"/>
               <w:right w:val="none" w:sz="0" w:space="0" w:color="000000"/>
@@ -7086,7 +7086,7 @@
         <w:tc>
           <w:tcPr>
             <w:tcBorders>
-              <w:bottom w:val="single" w:sz="12" w:space="0" w:color="666666"/>
+              <w:bottom w:val="none" w:sz="0" w:space="0" w:color="000000"/>
               <w:top w:val="none" w:sz="0" w:space="0" w:color="000000"/>
               <w:left w:val="none" w:sz="0" w:space="0" w:color="000000"/>
               <w:right w:val="none" w:sz="0" w:space="0" w:color="000000"/>
@@ -7531,7 +7531,7 @@
         <w:tc>
           <w:tcPr>
             <w:tcBorders>
-              <w:bottom w:val="none" w:sz="0" w:space="0" w:color="000000"/>
+              <w:bottom w:val="single" w:sz="12" w:space="0" w:color="666666"/>
               <w:top w:val="none" w:sz="0" w:space="0" w:color="000000"/>
               <w:left w:val="none" w:sz="0" w:space="0" w:color="000000"/>
               <w:right w:val="none" w:sz="0" w:space="0" w:color="000000"/>

</xml_diff>